<commit_message>
Update WCQ template with corrected version
Co-Authored-By: Claude Opus 4.6 <noreply@anthropic.com>
</commit_message>
<xml_diff>
--- a/templates/WCQ_TEMPLATE.docx
+++ b/templates/WCQ_TEMPLATE.docx
@@ -669,7 +669,12 @@
       </w:r>
     </w:p>
     <w:sectPr>
-      <w:headerReference w:type="default" r:id="rId9"/>
+      <w:headerReference w:type="even" r:id="rId9"/>
+      <w:headerReference w:type="default" r:id="rId10"/>
+      <w:footerReference w:type="even" r:id="rId11"/>
+      <w:footerReference w:type="default" r:id="rId12"/>
+      <w:headerReference w:type="first" r:id="rId13"/>
+      <w:footerReference w:type="first" r:id="rId14"/>
       <w:type w:val="continuous"/>
       <w:pgSz w:w="11910" w:h="16840"/>
       <w:pgMar w:top="2840" w:right="1559" w:bottom="0" w:left="1417" w:header="21" w:footer="0" w:gutter="0"/>
@@ -699,6 +704,36 @@
 </w:endnotes>
 </file>
 
+<file path=word/footer1.xml><?xml version="1.0" encoding="utf-8"?>
+<w:ftr xmlns:wpc="http://schemas.microsoft.com/office/word/2010/wordprocessingCanvas" xmlns:cx="http://schemas.microsoft.com/office/drawing/2014/chartex" xmlns:cx1="http://schemas.microsoft.com/office/drawing/2015/9/8/chartex" xmlns:cx2="http://schemas.microsoft.com/office/drawing/2015/10/21/chartex" xmlns:cx3="http://schemas.microsoft.com/office/drawing/2016/5/9/chartex" xmlns:cx4="http://schemas.microsoft.com/office/drawing/2016/5/10/chartex" xmlns:cx5="http://schemas.microsoft.com/office/drawing/2016/5/11/chartex" xmlns:cx6="http://schemas.microsoft.com/office/drawing/2016/5/12/chartex" xmlns:cx7="http://schemas.microsoft.com/office/drawing/2016/5/13/chartex" xmlns:cx8="http://schemas.microsoft.com/office/drawing/2016/5/14/chartex" xmlns:mc="http://schemas.openxmlformats.org/markup-compatibility/2006" xmlns:aink="http://schemas.microsoft.com/office/drawing/2016/ink" xmlns:am3d="http://schemas.microsoft.com/office/drawing/2017/model3d" xmlns:o="urn:schemas-microsoft-com:office:office" xmlns:oel="http://schemas.microsoft.com/office/2019/extlst" xmlns:r="http://schemas.openxmlformats.org/officeDocument/2006/relationships" xmlns:m="http://schemas.openxmlformats.org/officeDocument/2006/math" xmlns:v="urn:schemas-microsoft-com:vml" xmlns:wp14="http://schemas.microsoft.com/office/word/2010/wordprocessingDrawing" xmlns:wp="http://schemas.openxmlformats.org/drawingml/2006/wordprocessingDrawing" xmlns:w10="urn:schemas-microsoft-com:office:word" xmlns:w="http://schemas.openxmlformats.org/wordprocessingml/2006/main" xmlns:w14="http://schemas.microsoft.com/office/word/2010/wordml" xmlns:w15="http://schemas.microsoft.com/office/word/2012/wordml" xmlns:w16cex="http://schemas.microsoft.com/office/word/2018/wordml/cex" xmlns:w16cid="http://schemas.microsoft.com/office/word/2016/wordml/cid" xmlns:w16="http://schemas.microsoft.com/office/word/2018/wordml" xmlns:w16du="http://schemas.microsoft.com/office/word/2023/wordml/word16du" xmlns:w16sdtdh="http://schemas.microsoft.com/office/word/2020/wordml/sdtdatahash" xmlns:w16sdtfl="http://schemas.microsoft.com/office/word/2024/wordml/sdtformatlock" xmlns:w16se="http://schemas.microsoft.com/office/word/2015/wordml/symex" xmlns:wpg="http://schemas.microsoft.com/office/word/2010/wordprocessingGroup" xmlns:wpi="http://schemas.microsoft.com/office/word/2010/wordprocessingInk" xmlns:wne="http://schemas.microsoft.com/office/word/2006/wordml" xmlns:wps="http://schemas.microsoft.com/office/word/2010/wordprocessingShape" mc:Ignorable="w14 w15 w16se w16cid w16 w16cex w16sdtdh w16sdtfl w16du wp14">
+  <w:p>
+    <w:pPr>
+      <w:pStyle w:val="Footer"/>
+    </w:pPr>
+  </w:p>
+</w:ftr>
+</file>
+
+<file path=word/footer2.xml><?xml version="1.0" encoding="utf-8"?>
+<w:ftr xmlns:wpc="http://schemas.microsoft.com/office/word/2010/wordprocessingCanvas" xmlns:cx="http://schemas.microsoft.com/office/drawing/2014/chartex" xmlns:cx1="http://schemas.microsoft.com/office/drawing/2015/9/8/chartex" xmlns:cx2="http://schemas.microsoft.com/office/drawing/2015/10/21/chartex" xmlns:cx3="http://schemas.microsoft.com/office/drawing/2016/5/9/chartex" xmlns:cx4="http://schemas.microsoft.com/office/drawing/2016/5/10/chartex" xmlns:cx5="http://schemas.microsoft.com/office/drawing/2016/5/11/chartex" xmlns:cx6="http://schemas.microsoft.com/office/drawing/2016/5/12/chartex" xmlns:cx7="http://schemas.microsoft.com/office/drawing/2016/5/13/chartex" xmlns:cx8="http://schemas.microsoft.com/office/drawing/2016/5/14/chartex" xmlns:mc="http://schemas.openxmlformats.org/markup-compatibility/2006" xmlns:aink="http://schemas.microsoft.com/office/drawing/2016/ink" xmlns:am3d="http://schemas.microsoft.com/office/drawing/2017/model3d" xmlns:o="urn:schemas-microsoft-com:office:office" xmlns:oel="http://schemas.microsoft.com/office/2019/extlst" xmlns:r="http://schemas.openxmlformats.org/officeDocument/2006/relationships" xmlns:m="http://schemas.openxmlformats.org/officeDocument/2006/math" xmlns:v="urn:schemas-microsoft-com:vml" xmlns:wp14="http://schemas.microsoft.com/office/word/2010/wordprocessingDrawing" xmlns:wp="http://schemas.openxmlformats.org/drawingml/2006/wordprocessingDrawing" xmlns:w10="urn:schemas-microsoft-com:office:word" xmlns:w="http://schemas.openxmlformats.org/wordprocessingml/2006/main" xmlns:w14="http://schemas.microsoft.com/office/word/2010/wordml" xmlns:w15="http://schemas.microsoft.com/office/word/2012/wordml" xmlns:w16cex="http://schemas.microsoft.com/office/word/2018/wordml/cex" xmlns:w16cid="http://schemas.microsoft.com/office/word/2016/wordml/cid" xmlns:w16="http://schemas.microsoft.com/office/word/2018/wordml" xmlns:w16du="http://schemas.microsoft.com/office/word/2023/wordml/word16du" xmlns:w16sdtdh="http://schemas.microsoft.com/office/word/2020/wordml/sdtdatahash" xmlns:w16sdtfl="http://schemas.microsoft.com/office/word/2024/wordml/sdtformatlock" xmlns:w16se="http://schemas.microsoft.com/office/word/2015/wordml/symex" xmlns:wpg="http://schemas.microsoft.com/office/word/2010/wordprocessingGroup" xmlns:wpi="http://schemas.microsoft.com/office/word/2010/wordprocessingInk" xmlns:wne="http://schemas.microsoft.com/office/word/2006/wordml" xmlns:wps="http://schemas.microsoft.com/office/word/2010/wordprocessingShape" mc:Ignorable="w14 w15 w16se w16cid w16 w16cex w16sdtdh w16sdtfl w16du wp14">
+  <w:p>
+    <w:pPr>
+      <w:pStyle w:val="Footer"/>
+    </w:pPr>
+  </w:p>
+</w:ftr>
+</file>
+
+<file path=word/footer3.xml><?xml version="1.0" encoding="utf-8"?>
+<w:ftr xmlns:wpc="http://schemas.microsoft.com/office/word/2010/wordprocessingCanvas" xmlns:cx="http://schemas.microsoft.com/office/drawing/2014/chartex" xmlns:cx1="http://schemas.microsoft.com/office/drawing/2015/9/8/chartex" xmlns:cx2="http://schemas.microsoft.com/office/drawing/2015/10/21/chartex" xmlns:cx3="http://schemas.microsoft.com/office/drawing/2016/5/9/chartex" xmlns:cx4="http://schemas.microsoft.com/office/drawing/2016/5/10/chartex" xmlns:cx5="http://schemas.microsoft.com/office/drawing/2016/5/11/chartex" xmlns:cx6="http://schemas.microsoft.com/office/drawing/2016/5/12/chartex" xmlns:cx7="http://schemas.microsoft.com/office/drawing/2016/5/13/chartex" xmlns:cx8="http://schemas.microsoft.com/office/drawing/2016/5/14/chartex" xmlns:mc="http://schemas.openxmlformats.org/markup-compatibility/2006" xmlns:aink="http://schemas.microsoft.com/office/drawing/2016/ink" xmlns:am3d="http://schemas.microsoft.com/office/drawing/2017/model3d" xmlns:o="urn:schemas-microsoft-com:office:office" xmlns:oel="http://schemas.microsoft.com/office/2019/extlst" xmlns:r="http://schemas.openxmlformats.org/officeDocument/2006/relationships" xmlns:m="http://schemas.openxmlformats.org/officeDocument/2006/math" xmlns:v="urn:schemas-microsoft-com:vml" xmlns:wp14="http://schemas.microsoft.com/office/word/2010/wordprocessingDrawing" xmlns:wp="http://schemas.openxmlformats.org/drawingml/2006/wordprocessingDrawing" xmlns:w10="urn:schemas-microsoft-com:office:word" xmlns:w="http://schemas.openxmlformats.org/wordprocessingml/2006/main" xmlns:w14="http://schemas.microsoft.com/office/word/2010/wordml" xmlns:w15="http://schemas.microsoft.com/office/word/2012/wordml" xmlns:w16cex="http://schemas.microsoft.com/office/word/2018/wordml/cex" xmlns:w16cid="http://schemas.microsoft.com/office/word/2016/wordml/cid" xmlns:w16="http://schemas.microsoft.com/office/word/2018/wordml" xmlns:w16du="http://schemas.microsoft.com/office/word/2023/wordml/word16du" xmlns:w16sdtdh="http://schemas.microsoft.com/office/word/2020/wordml/sdtdatahash" xmlns:w16sdtfl="http://schemas.microsoft.com/office/word/2024/wordml/sdtformatlock" xmlns:w16se="http://schemas.microsoft.com/office/word/2015/wordml/symex" xmlns:wpg="http://schemas.microsoft.com/office/word/2010/wordprocessingGroup" xmlns:wpi="http://schemas.microsoft.com/office/word/2010/wordprocessingInk" xmlns:wne="http://schemas.microsoft.com/office/word/2006/wordml" xmlns:wps="http://schemas.microsoft.com/office/word/2010/wordprocessingShape" mc:Ignorable="w14 w15 w16se w16cid w16 w16cex w16sdtdh w16sdtfl w16du wp14">
+  <w:p>
+    <w:pPr>
+      <w:pStyle w:val="Footer"/>
+    </w:pPr>
+  </w:p>
+</w:ftr>
+</file>
+
 <file path=word/footnotes.xml><?xml version="1.0" encoding="utf-8"?>
 <w:footnotes xmlns:wpc="http://schemas.microsoft.com/office/word/2010/wordprocessingCanvas" xmlns:cx="http://schemas.microsoft.com/office/drawing/2014/chartex" xmlns:cx1="http://schemas.microsoft.com/office/drawing/2015/9/8/chartex" xmlns:cx2="http://schemas.microsoft.com/office/drawing/2015/10/21/chartex" xmlns:cx3="http://schemas.microsoft.com/office/drawing/2016/5/9/chartex" xmlns:cx4="http://schemas.microsoft.com/office/drawing/2016/5/10/chartex" xmlns:cx5="http://schemas.microsoft.com/office/drawing/2016/5/11/chartex" xmlns:cx6="http://schemas.microsoft.com/office/drawing/2016/5/12/chartex" xmlns:cx7="http://schemas.microsoft.com/office/drawing/2016/5/13/chartex" xmlns:cx8="http://schemas.microsoft.com/office/drawing/2016/5/14/chartex" xmlns:mc="http://schemas.openxmlformats.org/markup-compatibility/2006" xmlns:aink="http://schemas.microsoft.com/office/drawing/2016/ink" xmlns:am3d="http://schemas.microsoft.com/office/drawing/2017/model3d" xmlns:o="urn:schemas-microsoft-com:office:office" xmlns:oel="http://schemas.microsoft.com/office/2019/extlst" xmlns:r="http://schemas.openxmlformats.org/officeDocument/2006/relationships" xmlns:m="http://schemas.openxmlformats.org/officeDocument/2006/math" xmlns:v="urn:schemas-microsoft-com:vml" xmlns:wp14="http://schemas.microsoft.com/office/word/2010/wordprocessingDrawing" xmlns:wp="http://schemas.openxmlformats.org/drawingml/2006/wordprocessingDrawing" xmlns:w10="urn:schemas-microsoft-com:office:word" xmlns:w="http://schemas.openxmlformats.org/wordprocessingml/2006/main" xmlns:w14="http://schemas.microsoft.com/office/word/2010/wordml" xmlns:w15="http://schemas.microsoft.com/office/word/2012/wordml" xmlns:w16cex="http://schemas.microsoft.com/office/word/2018/wordml/cex" xmlns:w16cid="http://schemas.microsoft.com/office/word/2016/wordml/cid" xmlns:w16="http://schemas.microsoft.com/office/word/2018/wordml" xmlns:w16du="http://schemas.microsoft.com/office/word/2023/wordml/word16du" xmlns:w16sdtdh="http://schemas.microsoft.com/office/word/2020/wordml/sdtdatahash" xmlns:w16sdtfl="http://schemas.microsoft.com/office/word/2024/wordml/sdtformatlock" xmlns:w16se="http://schemas.microsoft.com/office/word/2015/wordml/symex" xmlns:wpg="http://schemas.microsoft.com/office/word/2010/wordprocessingGroup" xmlns:wpi="http://schemas.microsoft.com/office/word/2010/wordprocessingInk" xmlns:wne="http://schemas.microsoft.com/office/word/2006/wordml" xmlns:wps="http://schemas.microsoft.com/office/word/2010/wordprocessingShape" mc:Ignorable="w14 w15 w16se w16cid w16 w16cex w16sdtdh w16sdtfl w16du wp14">
   <w:footnote w:type="separator" w:id="-1">
@@ -719,6 +754,16 @@
 </file>
 
 <file path=word/header1.xml><?xml version="1.0" encoding="utf-8"?>
+<w:hdr xmlns:wpc="http://schemas.microsoft.com/office/word/2010/wordprocessingCanvas" xmlns:cx="http://schemas.microsoft.com/office/drawing/2014/chartex" xmlns:cx1="http://schemas.microsoft.com/office/drawing/2015/9/8/chartex" xmlns:cx2="http://schemas.microsoft.com/office/drawing/2015/10/21/chartex" xmlns:cx3="http://schemas.microsoft.com/office/drawing/2016/5/9/chartex" xmlns:cx4="http://schemas.microsoft.com/office/drawing/2016/5/10/chartex" xmlns:cx5="http://schemas.microsoft.com/office/drawing/2016/5/11/chartex" xmlns:cx6="http://schemas.microsoft.com/office/drawing/2016/5/12/chartex" xmlns:cx7="http://schemas.microsoft.com/office/drawing/2016/5/13/chartex" xmlns:cx8="http://schemas.microsoft.com/office/drawing/2016/5/14/chartex" xmlns:mc="http://schemas.openxmlformats.org/markup-compatibility/2006" xmlns:aink="http://schemas.microsoft.com/office/drawing/2016/ink" xmlns:am3d="http://schemas.microsoft.com/office/drawing/2017/model3d" xmlns:o="urn:schemas-microsoft-com:office:office" xmlns:oel="http://schemas.microsoft.com/office/2019/extlst" xmlns:r="http://schemas.openxmlformats.org/officeDocument/2006/relationships" xmlns:m="http://schemas.openxmlformats.org/officeDocument/2006/math" xmlns:v="urn:schemas-microsoft-com:vml" xmlns:wp14="http://schemas.microsoft.com/office/word/2010/wordprocessingDrawing" xmlns:wp="http://schemas.openxmlformats.org/drawingml/2006/wordprocessingDrawing" xmlns:w10="urn:schemas-microsoft-com:office:word" xmlns:w="http://schemas.openxmlformats.org/wordprocessingml/2006/main" xmlns:w14="http://schemas.microsoft.com/office/word/2010/wordml" xmlns:w15="http://schemas.microsoft.com/office/word/2012/wordml" xmlns:w16cex="http://schemas.microsoft.com/office/word/2018/wordml/cex" xmlns:w16cid="http://schemas.microsoft.com/office/word/2016/wordml/cid" xmlns:w16="http://schemas.microsoft.com/office/word/2018/wordml" xmlns:w16du="http://schemas.microsoft.com/office/word/2023/wordml/word16du" xmlns:w16sdtdh="http://schemas.microsoft.com/office/word/2020/wordml/sdtdatahash" xmlns:w16sdtfl="http://schemas.microsoft.com/office/word/2024/wordml/sdtformatlock" xmlns:w16se="http://schemas.microsoft.com/office/word/2015/wordml/symex" xmlns:wpg="http://schemas.microsoft.com/office/word/2010/wordprocessingGroup" xmlns:wpi="http://schemas.microsoft.com/office/word/2010/wordprocessingInk" xmlns:wne="http://schemas.microsoft.com/office/word/2006/wordml" xmlns:wps="http://schemas.microsoft.com/office/word/2010/wordprocessingShape" mc:Ignorable="w14 w15 w16se w16cid w16 w16cex w16sdtdh w16sdtfl w16du wp14">
+  <w:p>
+    <w:pPr>
+      <w:pStyle w:val="Header"/>
+    </w:pPr>
+  </w:p>
+</w:hdr>
+</file>
+
+<file path=word/header2.xml><?xml version="1.0" encoding="utf-8"?>
 <w:hdr xmlns:wpc="http://schemas.microsoft.com/office/word/2010/wordprocessingCanvas" xmlns:cx="http://schemas.microsoft.com/office/drawing/2014/chartex" xmlns:cx1="http://schemas.microsoft.com/office/drawing/2015/9/8/chartex" xmlns:cx2="http://schemas.microsoft.com/office/drawing/2015/10/21/chartex" xmlns:cx3="http://schemas.microsoft.com/office/drawing/2016/5/9/chartex" xmlns:cx4="http://schemas.microsoft.com/office/drawing/2016/5/10/chartex" xmlns:cx5="http://schemas.microsoft.com/office/drawing/2016/5/11/chartex" xmlns:cx6="http://schemas.microsoft.com/office/drawing/2016/5/12/chartex" xmlns:cx7="http://schemas.microsoft.com/office/drawing/2016/5/13/chartex" xmlns:cx8="http://schemas.microsoft.com/office/drawing/2016/5/14/chartex" xmlns:mc="http://schemas.openxmlformats.org/markup-compatibility/2006" xmlns:aink="http://schemas.microsoft.com/office/drawing/2016/ink" xmlns:am3d="http://schemas.microsoft.com/office/drawing/2017/model3d" xmlns:o="urn:schemas-microsoft-com:office:office" xmlns:oel="http://schemas.microsoft.com/office/2019/extlst" xmlns:r="http://schemas.openxmlformats.org/officeDocument/2006/relationships" xmlns:m="http://schemas.openxmlformats.org/officeDocument/2006/math" xmlns:v="urn:schemas-microsoft-com:vml" xmlns:wp14="http://schemas.microsoft.com/office/word/2010/wordprocessingDrawing" xmlns:wp="http://schemas.openxmlformats.org/drawingml/2006/wordprocessingDrawing" xmlns:w10="urn:schemas-microsoft-com:office:word" xmlns:w="http://schemas.openxmlformats.org/wordprocessingml/2006/main" xmlns:w14="http://schemas.microsoft.com/office/word/2010/wordml" xmlns:w15="http://schemas.microsoft.com/office/word/2012/wordml" xmlns:w16cex="http://schemas.microsoft.com/office/word/2018/wordml/cex" xmlns:w16cid="http://schemas.microsoft.com/office/word/2016/wordml/cid" xmlns:w16="http://schemas.microsoft.com/office/word/2018/wordml" xmlns:w16du="http://schemas.microsoft.com/office/word/2023/wordml/word16du" xmlns:w16sdtdh="http://schemas.microsoft.com/office/word/2020/wordml/sdtdatahash" xmlns:w16sdtfl="http://schemas.microsoft.com/office/word/2024/wordml/sdtformatlock" xmlns:w16se="http://schemas.microsoft.com/office/word/2015/wordml/symex" xmlns:wpg="http://schemas.microsoft.com/office/word/2010/wordprocessingGroup" xmlns:wpi="http://schemas.microsoft.com/office/word/2010/wordprocessingInk" xmlns:wne="http://schemas.microsoft.com/office/word/2006/wordml" xmlns:wps="http://schemas.microsoft.com/office/word/2010/wordprocessingShape" mc:Ignorable="w14 w15 w16se w16cid w16 w16cex w16sdtdh w16sdtfl w16du wp14">
   <w:p>
     <w:pPr>
@@ -866,44 +911,6 @@
                             <w:spacing w:before="34"/>
                             <w:ind w:left="20"/>
                           </w:pPr>
-                          <w:r>
-                            <w:rPr>
-                              <w:color w:val="ED0000"/>
-                              <w:w w:val="110"/>
-                            </w:rPr>
-                            <w:t>January</w:t>
-                          </w:r>
-                          <w:r>
-                            <w:rPr>
-                              <w:color w:val="ED0000"/>
-                              <w:spacing w:val="-5"/>
-                              <w:w w:val="110"/>
-                            </w:rPr>
-                            <w:t xml:space="preserve"> </w:t>
-                          </w:r>
-                          <w:r>
-                            <w:rPr>
-                              <w:color w:val="ED0000"/>
-                              <w:w w:val="110"/>
-                            </w:rPr>
-                            <w:t>16,</w:t>
-                          </w:r>
-                          <w:r>
-                            <w:rPr>
-                              <w:color w:val="ED0000"/>
-                              <w:spacing w:val="-5"/>
-                              <w:w w:val="110"/>
-                            </w:rPr>
-                            <w:t xml:space="preserve"> </w:t>
-                          </w:r>
-                          <w:r>
-                            <w:rPr>
-                              <w:color w:val="ED0000"/>
-                              <w:spacing w:val="-4"/>
-                              <w:w w:val="110"/>
-                            </w:rPr>
-                            <w:t>2025</w:t>
-                          </w:r>
                         </w:p>
                       </w:txbxContent>
                     </wps:txbx>
@@ -931,44 +938,6 @@
                       <w:spacing w:before="34"/>
                       <w:ind w:left="20"/>
                     </w:pPr>
-                    <w:r>
-                      <w:rPr>
-                        <w:color w:val="ED0000"/>
-                        <w:w w:val="110"/>
-                      </w:rPr>
-                      <w:t>January</w:t>
-                    </w:r>
-                    <w:r>
-                      <w:rPr>
-                        <w:color w:val="ED0000"/>
-                        <w:spacing w:val="-5"/>
-                        <w:w w:val="110"/>
-                      </w:rPr>
-                      <w:t xml:space="preserve"> </w:t>
-                    </w:r>
-                    <w:r>
-                      <w:rPr>
-                        <w:color w:val="ED0000"/>
-                        <w:w w:val="110"/>
-                      </w:rPr>
-                      <w:t>16,</w:t>
-                    </w:r>
-                    <w:r>
-                      <w:rPr>
-                        <w:color w:val="ED0000"/>
-                        <w:spacing w:val="-5"/>
-                        <w:w w:val="110"/>
-                      </w:rPr>
-                      <w:t xml:space="preserve"> </w:t>
-                    </w:r>
-                    <w:r>
-                      <w:rPr>
-                        <w:color w:val="ED0000"/>
-                        <w:spacing w:val="-4"/>
-                        <w:w w:val="110"/>
-                      </w:rPr>
-                      <w:t>2025</w:t>
-                    </w:r>
                   </w:p>
                 </w:txbxContent>
               </v:textbox>
@@ -978,6 +947,16 @@
         </mc:Fallback>
       </mc:AlternateContent>
     </w:r>
+  </w:p>
+</w:hdr>
+</file>
+
+<file path=word/header3.xml><?xml version="1.0" encoding="utf-8"?>
+<w:hdr xmlns:wpc="http://schemas.microsoft.com/office/word/2010/wordprocessingCanvas" xmlns:cx="http://schemas.microsoft.com/office/drawing/2014/chartex" xmlns:cx1="http://schemas.microsoft.com/office/drawing/2015/9/8/chartex" xmlns:cx2="http://schemas.microsoft.com/office/drawing/2015/10/21/chartex" xmlns:cx3="http://schemas.microsoft.com/office/drawing/2016/5/9/chartex" xmlns:cx4="http://schemas.microsoft.com/office/drawing/2016/5/10/chartex" xmlns:cx5="http://schemas.microsoft.com/office/drawing/2016/5/11/chartex" xmlns:cx6="http://schemas.microsoft.com/office/drawing/2016/5/12/chartex" xmlns:cx7="http://schemas.microsoft.com/office/drawing/2016/5/13/chartex" xmlns:cx8="http://schemas.microsoft.com/office/drawing/2016/5/14/chartex" xmlns:mc="http://schemas.openxmlformats.org/markup-compatibility/2006" xmlns:aink="http://schemas.microsoft.com/office/drawing/2016/ink" xmlns:am3d="http://schemas.microsoft.com/office/drawing/2017/model3d" xmlns:o="urn:schemas-microsoft-com:office:office" xmlns:oel="http://schemas.microsoft.com/office/2019/extlst" xmlns:r="http://schemas.openxmlformats.org/officeDocument/2006/relationships" xmlns:m="http://schemas.openxmlformats.org/officeDocument/2006/math" xmlns:v="urn:schemas-microsoft-com:vml" xmlns:wp14="http://schemas.microsoft.com/office/word/2010/wordprocessingDrawing" xmlns:wp="http://schemas.openxmlformats.org/drawingml/2006/wordprocessingDrawing" xmlns:w10="urn:schemas-microsoft-com:office:word" xmlns:w="http://schemas.openxmlformats.org/wordprocessingml/2006/main" xmlns:w14="http://schemas.microsoft.com/office/word/2010/wordml" xmlns:w15="http://schemas.microsoft.com/office/word/2012/wordml" xmlns:w16cex="http://schemas.microsoft.com/office/word/2018/wordml/cex" xmlns:w16cid="http://schemas.microsoft.com/office/word/2016/wordml/cid" xmlns:w16="http://schemas.microsoft.com/office/word/2018/wordml" xmlns:w16du="http://schemas.microsoft.com/office/word/2023/wordml/word16du" xmlns:w16sdtdh="http://schemas.microsoft.com/office/word/2020/wordml/sdtdatahash" xmlns:w16sdtfl="http://schemas.microsoft.com/office/word/2024/wordml/sdtformatlock" xmlns:w16se="http://schemas.microsoft.com/office/word/2015/wordml/symex" xmlns:wpg="http://schemas.microsoft.com/office/word/2010/wordprocessingGroup" xmlns:wpi="http://schemas.microsoft.com/office/word/2010/wordprocessingInk" xmlns:wne="http://schemas.microsoft.com/office/word/2006/wordml" xmlns:wps="http://schemas.microsoft.com/office/word/2010/wordprocessingShape" mc:Ignorable="w14 w15 w16se w16cid w16 w16cex w16sdtdh w16sdtfl w16du wp14">
+  <w:p>
+    <w:pPr>
+      <w:pStyle w:val="Header"/>
+    </w:pPr>
   </w:p>
 </w:hdr>
 </file>

</xml_diff>